<commit_message>
Update financial donor engagement strategy
</commit_message>
<xml_diff>
--- a/financial_donor_engagement_strategy.docx
+++ b/financial_donor_engagement_strategy.docx
@@ -54,7 +54,7 @@
     </w:p>
     <w:p>
       <w:r>
-        <w:t>Goal: Moving mid-tier donors into the 'Major Gift' category through personalized thank-you calls, extracting qualitative 'Wealth Signals' and specific philanthropic interests. This process is triggered for donors identified in Section 5: Identifying the Mid-Tier.</w:t>
+        <w:t>Goal: Moving mid-tier donors into the 'Major Gift' category through personalized thank-you calls, extracting qualitative 'Wealth Signals' and specific philanthropic interests. This process is triggered for donors identified in Section 5.</w:t>
       </w:r>
     </w:p>
     <w:p>
@@ -63,11 +63,6 @@
       </w:pPr>
       <w:r>
         <w:t>2. Category 1 Emails: Proof of Scale (Efficiency)</w:t>
-      </w:r>
-    </w:p>
-    <w:p>
-      <w:r>
-        <w:t>Objective: To highlight how operational efficiencies and a low-friction platform further Replate's mission without over-complicating the technical narrative.</w:t>
       </w:r>
     </w:p>
     <w:p>
@@ -82,7 +77,7 @@
       <w:r>
         <w:t>Subject: Why 300+ companies trust Replate with their surplus</w:t>
         <w:br/>
-        <w:t>Preheader: Professional food rescue, powered by a simple platform.</w:t>
+        <w:t>Preheader: Professional food rescue, powered by Onfleet logistics.</w:t>
       </w:r>
     </w:p>
     <w:p>
@@ -90,17 +85,10 @@
         <w:t>For our partners like DoorDash and Chipotle, the barrier to donating food isn't a lack of heart—it’s a lack of time. In a busy kitchen, every second counts.</w:t>
         <w:br/>
         <w:br/>
-        <w:t>Replate's platform removes the 'coordination headache.' A kitchen manager can schedule a rescue in seconds, and our system takes care of the rest—identifying the right recipient and ensuring the pickup is prioritized for the nearest available driver.</w:t>
+        <w:t>Replate removes the 'coordination headache' by integrating directly with professional logistics tools like Onfleet. A kitchen manager can schedule a rescue in seconds, and our system automatically routes the nearest available driver, provides real-time GPS tracking, and ensures a seamless drop-off.</w:t>
         <w:br/>
         <w:br/>
-        <w:t>By making food rescue as easy as ordering a rideshare, we've enabled our partners to recover 4.9 million pounds of food to date.</w:t>
-      </w:r>
-    </w:p>
-    <w:p>
-      <w:r>
-        <w:t>[Link: See our 300+ Trusted Partners] — Signal: Brand/Trust Affinity</w:t>
-        <w:br/>
-        <w:t>[Link: See the Cities we serve] — Signal: Geographic/Scale Affinity</w:t>
+        <w:t>By making food rescue as reliable as a professional courier service, we've enabled our partners to recover 4.9 million pounds of food to date.</w:t>
       </w:r>
     </w:p>
     <w:p>
@@ -115,25 +103,15 @@
       <w:r>
         <w:t>Subject: 4.1 million meals—one simple click at a time</w:t>
         <w:br/>
-        <w:t>Preheader: How we removed the 'friction' from food rescue.</w:t>
+        <w:t>Preheader: Removing friction through automated last-mile logistics.</w:t>
       </w:r>
     </w:p>
     <w:p>
       <w:r>
-        <w:t>People often ask how a nonprofit scales to serve 301 recipient organizations across the country. The answer is simple: we made the process easy.</w:t>
+        <w:t>Being 'tech-enabled' means we’ve replaced phone tags and manual spreadsheets with a direct, automated platform. By leveraging Onfleet for our last-mile delivery management, we provide our rescuers with optimized routing and real-time communication tools.</w:t>
         <w:br/>
         <w:br/>
-        <w:t>Being 'tech-enabled' means we’ve replaced phone tags and manual spreadsheets with a direct platform. Our system automatically connects surplus food to the closest available rescue route, minimizing the distance our drivers travel and maximizing the speed at which fresh meals reach those in need.</w:t>
-        <w:br/>
-        <w:br/>
-        <w:t>This direct approach has allowed us to save 1.3 billion gallons of water and divert 4.5k metric tons of CO2e from our landfills. For our donors, it means your support goes directly into a system built for speed and impact, not overhead.</w:t>
-      </w:r>
-    </w:p>
-    <w:p>
-      <w:r>
-        <w:t>[Link: Why Simplicity Scales Impact] — Signal: Operational/Directness Affinity</w:t>
-        <w:br/>
-        <w:t>[Link: View our Impact Stats] — Signal: Data/ROI Affinity</w:t>
+        <w:t>This high-efficiency approach has allowed us to save 1.3 billion gallons of water and divert 4.5k metric tons of CO2e from landfills. For our donors, it means your support goes into a professional-grade logistics machine.</w:t>
       </w:r>
     </w:p>
     <w:p>
@@ -225,7 +203,7 @@
           </w:tcPr>
           <w:p>
             <w:r>
-              <w:t>Cities we serve</w:t>
+              <w:t>Onfleet Integration Details</w:t>
             </w:r>
           </w:p>
         </w:tc>
@@ -235,7 +213,7 @@
           </w:tcPr>
           <w:p>
             <w:r>
-              <w:t>THE STRATEGIST</w:t>
+              <w:t>THE INNOVATOR</w:t>
             </w:r>
           </w:p>
         </w:tc>
@@ -245,7 +223,7 @@
           </w:tcPr>
           <w:p>
             <w:r>
-              <w:t>Interested in the geographic footprint and service scale.</w:t>
+              <w:t>Interested in the professional-grade tech engine driving the mission.</w:t>
             </w:r>
           </w:p>
         </w:tc>
@@ -325,13 +303,7 @@
     </w:p>
     <w:p>
       <w:r>
-        <w:t>1. Segment: Use Amazon Athena/S3 to identify donors who engaged with the 'Pragmatist' (Google/Partner) or 'Director' (Efficiency) content.</w:t>
-        <w:br/>
-        <w:t>2. Seed: Extract their hashed emails and upload them to the Meta Custom Audience via meta_growth_engine.py.</w:t>
-        <w:br/>
-        <w:t>3. Lookalike: Create a 1-2% Lookalike Audience on Meta to find new potential donors with similar interests in 'Operational Efficiency' or 'CSR'.</w:t>
-        <w:br/>
-        <w:t>4. Creative: Deploy ads highlighting Replate's professional partnerships and simplified logistics to this new audience.</w:t>
+        <w:t>Use Amazon Athena/S3 to identify donors who engaged with the 'Pragmatist' or 'Innovator' (Onfleet) content and upload them to the Meta Custom Audience via meta_growth_engine.py.</w:t>
       </w:r>
     </w:p>
     <w:p>
@@ -344,7 +316,24 @@
     </w:p>
     <w:p>
       <w:r>
-        <w:t>Identifying 'Mid-Tier' donors requires a data-driven approach using AWS analytics to spot capacity and affinity before a major gift is even requested.</w:t>
+        <w:t>• Total Annual Giving: $500 – $2,500</w:t>
+        <w:br/>
+        <w:t>• Recurrence: 2+ gifts in the last 18 months.</w:t>
+        <w:br/>
+        <w:t>• Stealth VIP Signals: Clicks on technical 'Onfleet' or 'Impact Data' links.</w:t>
+      </w:r>
+    </w:p>
+    <w:p>
+      <w:pPr>
+        <w:pStyle w:val="Heading1"/>
+      </w:pPr>
+      <w:r>
+        <w:t>6. Appendix: Operational Authenticators</w:t>
+      </w:r>
+    </w:p>
+    <w:p>
+      <w:r>
+        <w:t>Use these specific details from Replate’s operational history to add authenticity to emails:</w:t>
       </w:r>
     </w:p>
     <w:p>
@@ -352,18 +341,17 @@
         <w:pStyle w:val="Heading2"/>
       </w:pPr>
       <w:r>
-        <w:t>A. Data Parameters (AWS Athena Query Filters)</w:t>
+        <w:t>A. Logistics Keywords</w:t>
       </w:r>
     </w:p>
     <w:p>
       <w:r>
-        <w:t>• Total Annual Giving: $500 – $2,500</w:t>
-        <w:br/>
-        <w:t>• Recurrence: 2+ gifts in the last 18 months.</w:t>
-        <w:br/>
-        <w:t>• Growth Velocity: Subsequent gifts are larger than the initial gift.</w:t>
-        <w:br/>
-        <w:t>• Professional Signal: Domain/Signature analysis (e.g., @firm.com) indicating high capacity.</w:t>
+        <w:t>• Onfleet Integration: Real-time GPS, proof-of-delivery photos, and automated recipient SMS.</w:t>
+      </w:r>
+    </w:p>
+    <w:p>
+      <w:r>
+        <w:t>• Last-Mile Management: Optimized routing to reduce driver idling and fuel waste.</w:t>
       </w:r>
     </w:p>
     <w:p>
@@ -371,35 +359,17 @@
         <w:pStyle w:val="Heading2"/>
       </w:pPr>
       <w:r>
-        <w:t>B. Stealth VIP Signals (High Affinity)</w:t>
+        <w:t>B. Human Impact Keywords (From Field Data)</w:t>
       </w:r>
     </w:p>
     <w:p>
       <w:r>
-        <w:t>• The Forwarder: Donors who share tracking links with 3+ others.</w:t>
-        <w:br/>
-        <w:t>• The Deep Reader: Clicks technical/data links in every email.</w:t>
-        <w:br/>
-        <w:t>• The Influencer: High professional standing detected via Amazon Comprehend.</w:t>
-      </w:r>
-    </w:p>
-    <w:p>
-      <w:pPr>
-        <w:pStyle w:val="Heading2"/>
-      </w:pPr>
-      <w:r>
-        <w:t>C. The Stewardship Workflow (Discovery Questions)</w:t>
+        <w:t>• Visual Descriptions: '11 trays of fresh roasted chicken and mashed potatoes' or 'Salmon salad with green goddess dressing.'</w:t>
       </w:r>
     </w:p>
     <w:p>
       <w:r>
-        <w:t>When making the 'Thank You' call (Use Case: Phone), staff should use these discovery questions to probe for major gift potential:</w:t>
-        <w:br/>
-        <w:t>1. Wealth Signal: 'Do you prefer to give via DAF (Donor Advised Fund) or stock?'</w:t>
-        <w:br/>
-        <w:t>2. Philanthropic Interest: 'What part of our mission—climate or hunger—resonates most with you?'</w:t>
-        <w:br/>
-        <w:t>3. Connection Signal: 'Do you know anyone else at [Their Company] who should hear about us?'</w:t>
+        <w:t>• Direct Metrics: Mentioning 'Trays Donated' alongside 'Pounds Recovered' for a more visceral impact.</w:t>
       </w:r>
     </w:p>
     <w:sectPr>

</xml_diff>